<commit_message>
package: shared manager account is now manager@playlive.melbourne (admin@ stays Guy-personal)
</commit_message>
<xml_diff>
--- a/docs/stakeholder-package/Staging_Test_Script.docx
+++ b/docs/stakeholder-package/Staging_Test_Script.docx
@@ -176,7 +176,7 @@
               <w:spacing w:after="20" w:before="20"/>
             </w:pPr>
             <w:r>
-              <w:t xml:space="preserve">admin@playlive.melbourne</w:t>
+              <w:t xml:space="preserve">manager@playlive.melbourne</w:t>
             </w:r>
           </w:p>
         </w:tc>
@@ -722,7 +722,7 @@
         <w:spacing w:after="120" w:before="240"/>
       </w:pPr>
       <w:r>
-        <w:t xml:space="preserve">What to try — Manager (admin login)</w:t>
+        <w:t xml:space="preserve">What to try — Manager (manager login)</w:t>
       </w:r>
     </w:p>
     <w:p>

</xml_diff>